<commit_message>
Mindset 01 _markers: remove the 4 + 12 leftover markers of the old item numbers in tracks 23/24 (numbers are Word list numbering now) and the empty first line
Co-Authored-By: Claude Opus 5.5 <noreply@anthropic.com>
Claude-Session: https://claude.ai/code/session_012pSExQcto6evNseoCu5P9v
</commit_message>
<xml_diff>
--- a/assets/data/Mindset 01/Mindset1- Audio Scripts_markers.docx
+++ b/assets/data/Mindset 01/Mindset1- Audio Scripts_markers.docx
@@ -6914,30 +6914,6 @@
           </w:tcPr>
           <w:p>
             <w:pPr>
-              <w:tabs>
-                <w:tab w:val="left" w:pos="4413"/>
-              </w:tabs>
-              <w:rPr>
-                <w:rFonts w:ascii="Source Sans 3" w:hAnsi="Source Sans 3"/>
-                <w:b/>
-                <w:bCs/>
-                <w:sz w:val="23"/>
-                <w:szCs w:val="23"/>
-              </w:rPr>
-            </w:pPr>
-            <w:r>
-              <w:rPr>
-                <w:rFonts w:ascii="Source Sans 3" w:hAnsi="Source Sans 3"/>
-                <w:b/>
-                <w:bCs/>
-                <w:sz w:val="23"/>
-                <w:szCs w:val="23"/>
-              </w:rPr>
-              <w:t>[0]</w:t>
-            </w:r>
-          </w:p>
-          <w:p>
-            <w:pPr>
               <w:pStyle w:val="ListParagraph"/>
               <w:numPr>
                 <w:ilvl w:val="0"/>
@@ -7027,7 +7003,7 @@
                 <w:sz w:val="23"/>
                 <w:szCs w:val="23"/>
               </w:rPr>
-              <w:t>[13020] Examiner</w:t>
+              <w:t xml:space="preserve"> Examiner</w:t>
             </w:r>
             <w:r>
               <w:rPr>
@@ -7094,7 +7070,7 @@
                 <w:sz w:val="23"/>
                 <w:szCs w:val="23"/>
               </w:rPr>
-              <w:t>[26320] Examiner</w:t>
+              <w:t xml:space="preserve"> Examiner</w:t>
             </w:r>
             <w:r>
               <w:rPr>
@@ -7161,7 +7137,7 @@
                 <w:sz w:val="23"/>
                 <w:szCs w:val="23"/>
               </w:rPr>
-              <w:t>[50280] Examiner</w:t>
+              <w:t xml:space="preserve"> Examiner</w:t>
             </w:r>
             <w:r>
               <w:rPr>
@@ -7264,26 +7240,6 @@
           </w:tcPr>
           <w:p>
             <w:pPr>
-              <w:tabs>
-                <w:tab w:val="left" w:pos="4413"/>
-              </w:tabs>
-              <w:rPr>
-                <w:rFonts w:ascii="Source Sans 3" w:hAnsi="Source Sans 3"/>
-                <w:sz w:val="23"/>
-                <w:szCs w:val="23"/>
-              </w:rPr>
-            </w:pPr>
-            <w:r>
-              <w:rPr>
-                <w:rFonts w:ascii="Source Sans 3" w:hAnsi="Source Sans 3"/>
-                <w:sz w:val="23"/>
-                <w:szCs w:val="23"/>
-              </w:rPr>
-              <w:t>[0]</w:t>
-            </w:r>
-          </w:p>
-          <w:p>
-            <w:pPr>
               <w:pStyle w:val="ListParagraph"/>
               <w:numPr>
                 <w:ilvl w:val="0"/>
@@ -7345,7 +7301,7 @@
                 <w:sz w:val="23"/>
                 <w:szCs w:val="23"/>
               </w:rPr>
-              <w:t>[8780] The[10760] statue[11400] was[11600] built[12080] in[15020] 1985.[15020]</w:t>
+              <w:t xml:space="preserve"> The[10760] statue[11400] was[11600] built[12080] in[15020] 1985.[15020]</w:t>
             </w:r>
           </w:p>
           <w:p>
@@ -7370,7 +7326,7 @@
                 <w:sz w:val="23"/>
                 <w:szCs w:val="23"/>
               </w:rPr>
-              <w:t>[15020] Our[18000] town[18520] is[18660] situated[19620] on[19820] the[19980] Yangtze[20500] river.[22760]</w:t>
+              <w:t xml:space="preserve"> Our[18000] town[18520] is[18660] situated[19620] on[19820] the[19980] Yangtze[20500] river.[22760]</w:t>
             </w:r>
           </w:p>
           <w:p>
@@ -7395,7 +7351,7 @@
                 <w:sz w:val="23"/>
                 <w:szCs w:val="23"/>
               </w:rPr>
-              <w:t>[22760] The[24780] shopping[25260] mall[25580] is[25740] called[26180] 'the[26480] Galleria'.[29200]</w:t>
+              <w:t xml:space="preserve"> The[24780] shopping[25260] mall[25580] is[25740] called[26180] 'the[26480] Galleria'.[29200]</w:t>
             </w:r>
           </w:p>
           <w:p>
@@ -7420,7 +7376,7 @@
                 <w:sz w:val="23"/>
                 <w:szCs w:val="23"/>
               </w:rPr>
-              <w:t>[29200] The[31260] library[31960] is[32140] located[32960] across[33460] from[33640] the[33800] swimming[34200] pool.[36520]</w:t>
+              <w:t xml:space="preserve"> The[31260] library[31960] is[32140] located[32960] across[33460] from[33640] the[33800] swimming[34200] pool.[36520]</w:t>
             </w:r>
           </w:p>
           <w:p>
@@ -7445,7 +7401,7 @@
                 <w:sz w:val="23"/>
                 <w:szCs w:val="23"/>
               </w:rPr>
-              <w:t>[36520] Many[38780] things[39040] have[39320] changed[39960] over[40180] the[40300] years[40700] in[40820] my[41060] home[41400] town.[43680]</w:t>
+              <w:t xml:space="preserve"> Many[38780] things[39040] have[39320] changed[39960] over[40180] the[40300] years[40700] in[40820] my[41060] home[41400] town.[43680]</w:t>
             </w:r>
           </w:p>
           <w:p>
@@ -7470,7 +7426,7 @@
                 <w:sz w:val="23"/>
                 <w:szCs w:val="23"/>
               </w:rPr>
-              <w:t>[43680] A[45640] number[46080] of[46240] new[46480] apartments[47300] were[47500] developed[48120] by[48380] the[48520] harbour.[50840]</w:t>
+              <w:t xml:space="preserve"> A[45640] number[46080] of[46240] new[46480] apartments[47300] were[47500] developed[48120] by[48380] the[48520] harbour.[50840]</w:t>
             </w:r>
           </w:p>
           <w:p>
@@ -7495,7 +7451,7 @@
                 <w:sz w:val="23"/>
                 <w:szCs w:val="23"/>
               </w:rPr>
-              <w:t>[50840] The[52800] bridge[53180] was[53380] designed[54120] by[54360] a[54480] famous[55080] architect[55740] from[55980] London.[58420]</w:t>
+              <w:t xml:space="preserve"> The[52800] bridge[53180] was[53380] designed[54120] by[54360] a[54480] famous[55080] architect[55740] from[55980] London.[58420]</w:t>
             </w:r>
           </w:p>
           <w:p>
@@ -7520,7 +7476,7 @@
                 <w:sz w:val="23"/>
                 <w:szCs w:val="23"/>
               </w:rPr>
-              <w:t>[58420] Recently,[61240] scientists[62440] discovered[63060] a[63160] large[63680] cave[64280] near[64540] our[64740] village.[67100]</w:t>
+              <w:t xml:space="preserve"> Recently,[61240] scientists[62440] discovered[63060] a[63160] large[63680] cave[64280] near[64540] our[64740] village.[67100]</w:t>
             </w:r>
           </w:p>
           <w:p>
@@ -7545,7 +7501,7 @@
                 <w:sz w:val="23"/>
                 <w:szCs w:val="23"/>
               </w:rPr>
-              <w:t>[67100] Recently,[69840] many[70500] young[70940] people[71460] have[71720] started[72320] to[72520] leave[72920] my[73140] home[73460] town[73940] to[74120] look[74400] for[74580] work.[76960]</w:t>
+              <w:t xml:space="preserve"> Recently,[69840] many[70500] young[70940] people[71460] have[71720] started[72320] to[72520] leave[72920] my[73140] home[73460] town[73940] to[74120] look[74400] for[74580] work.[76960]</w:t>
             </w:r>
           </w:p>
           <w:p>
@@ -7571,7 +7527,7 @@
                 <w:szCs w:val="23"/>
               </w:rPr>
               <w:lastRenderedPageBreak/>
-              <w:t>[76960] A[78960] long[79240] time[79600] ago[80060] many[80600] people[81120] used[81460] to[81600] work[81920] in[82080] factories[82820] in[82960] my[83200] town.[85540]</w:t>
+              <w:t xml:space="preserve"> A[78960] long[79240] time[79600] ago[80060] many[80600] people[81120] used[81460] to[81600] work[81920] in[82080] factories[82820] in[82960] my[83200] town.[85540]</w:t>
             </w:r>
           </w:p>
           <w:p>
@@ -7597,7 +7553,7 @@
                 <w:sz w:val="23"/>
                 <w:szCs w:val="23"/>
               </w:rPr>
-              <w:t>[85540] A[87500] tourist[88180] who[88320] visited[88860] recently[89560] said[89980] our[90260] town[90800] is[90980] a[91080] great[91620] place[92040] to[92160] visit.[92620]</w:t>
+              <w:t xml:space="preserve"> A[87500] tourist[88180] who[88320] visited[88860] recently[89560] said[89980] our[90260] town[90800] is[90980] a[91080] great[91620] place[92040] to[92160] visit.[92620]</w:t>
             </w:r>
           </w:p>
         </w:tc>

</xml_diff>